<commit_message>
Do 5.11.: Reim-Schnipsel in drei Sport-Fassungen, Aufdeck-Folien je Nummer, Handreichung mit deutschen Reimbegriffen
Co-Authored-By: Claude Opus 5.5 <noreply@anthropic.com>
Claude-Session: https://claude.ai/code/session_01KXvLXHMYPnCyEbMRgNaaYs
</commit_message>
<xml_diff>
--- a/Deutsch_7A/Balladen/Woche2/Handreichung_Polnisch_05-11.docx
+++ b/Deutsch_7A/Balladen/Woche2/Handreichung_Polnisch_05-11.docx
@@ -577,293 +577,7 @@
                 <w:sz w:val="19"/>
                 <w:szCs w:val="19"/>
               </w:rPr>
-              <w:t xml:space="preserve">układ rymów (litery a, b, c …)</w:t>
-            </w:r>
-          </w:p>
-        </w:tc>
-      </w:tr>
-      <w:tr>
-        <w:trPr>
-          <w:cantSplit/>
-        </w:trPr>
-        <w:tc>
-          <w:tcPr>
-            <w:tcW w:type="dxa" w:w="2300"/>
-            <w:tcBorders>
-              <w:top w:val="single" w:color="C9D3EA" w:sz="6"/>
-              <w:left w:val="single" w:color="C9D3EA" w:sz="6"/>
-              <w:bottom w:val="single" w:color="C9D3EA" w:sz="6"/>
-              <w:right w:val="single" w:color="C9D3EA" w:sz="6"/>
-            </w:tcBorders>
-            <w:tcMar>
-              <w:top w:type="dxa" w:w="15"/>
-              <w:left w:type="dxa" w:w="60"/>
-              <w:bottom w:type="dxa" w:w="15"/>
-              <w:right w:type="dxa" w:w="100"/>
-            </w:tcMar>
-            <w:vAlign w:val="center"/>
-          </w:tcPr>
-          <w:p>
-            <w:pPr>
-              <w:spacing w:after="0" w:before="0"/>
-            </w:pPr>
-            <w:r>
-              <w:rPr>
-                <w:rFonts w:ascii="Calibri" w:cs="Calibri" w:eastAsia="Calibri" w:hAnsi="Calibri"/>
-                <w:b/>
-                <w:bCs/>
-                <w:color w:val="1E2761"/>
-                <w:sz w:val="19"/>
-                <w:szCs w:val="19"/>
-              </w:rPr>
-              <w:t xml:space="preserve">der Paarreim (aabb)</w:t>
-            </w:r>
-          </w:p>
-        </w:tc>
-        <w:tc>
-          <w:tcPr>
-            <w:tcW w:type="dxa" w:w="3233"/>
-            <w:tcBorders>
-              <w:top w:val="single" w:color="C9D3EA" w:sz="6"/>
-              <w:left w:val="single" w:color="C9D3EA" w:sz="6"/>
-              <w:bottom w:val="single" w:color="C9D3EA" w:sz="6"/>
-              <w:right w:val="single" w:color="C9D3EA" w:sz="6"/>
-            </w:tcBorders>
-            <w:shd w:fill="FBFCFF" w:color="auto" w:val="clear"/>
-            <w:tcMar>
-              <w:top w:type="dxa" w:w="15"/>
-              <w:left w:type="dxa" w:w="60"/>
-              <w:bottom w:type="dxa" w:w="15"/>
-              <w:right w:type="dxa" w:w="100"/>
-            </w:tcMar>
-            <w:vAlign w:val="center"/>
-          </w:tcPr>
-          <w:p>
-            <w:pPr>
-              <w:spacing w:after="0" w:before="0"/>
-            </w:pPr>
-            <w:r>
-              <w:rPr>
-                <w:rFonts w:ascii="Calibri" w:cs="Calibri" w:eastAsia="Calibri" w:hAnsi="Calibri"/>
-                <w:i w:val="false"/>
-                <w:iCs w:val="false"/>
-                <w:color w:val="333333"/>
-                <w:sz w:val="19"/>
-                <w:szCs w:val="19"/>
-              </w:rPr>
-              <w:t xml:space="preserve">rym parzysty</w:t>
-            </w:r>
-          </w:p>
-        </w:tc>
-        <w:tc>
-          <w:tcPr>
-            <w:tcW w:type="dxa" w:w="2300"/>
-            <w:tcBorders>
-              <w:top w:val="single" w:color="C9D3EA" w:sz="6"/>
-              <w:left w:val="single" w:color="C9D3EA" w:sz="6"/>
-              <w:bottom w:val="single" w:color="C9D3EA" w:sz="6"/>
-              <w:right w:val="single" w:color="C9D3EA" w:sz="6"/>
-            </w:tcBorders>
-            <w:tcMar>
-              <w:top w:type="dxa" w:w="15"/>
-              <w:left w:type="dxa" w:w="60"/>
-              <w:bottom w:type="dxa" w:w="15"/>
-              <w:right w:type="dxa" w:w="100"/>
-            </w:tcMar>
-            <w:vAlign w:val="center"/>
-          </w:tcPr>
-          <w:p>
-            <w:pPr>
-              <w:spacing w:after="0" w:before="0"/>
-            </w:pPr>
-            <w:r>
-              <w:rPr>
-                <w:rFonts w:ascii="Calibri" w:cs="Calibri" w:eastAsia="Calibri" w:hAnsi="Calibri"/>
-                <w:b/>
-                <w:bCs/>
-                <w:color w:val="1E2761"/>
-                <w:sz w:val="19"/>
-                <w:szCs w:val="19"/>
-              </w:rPr>
-              <w:t xml:space="preserve">der Kreuzreim (abab)</w:t>
-            </w:r>
-          </w:p>
-        </w:tc>
-        <w:tc>
-          <w:tcPr>
-            <w:tcW w:type="dxa" w:w="3233"/>
-            <w:tcBorders>
-              <w:top w:val="single" w:color="C9D3EA" w:sz="6"/>
-              <w:left w:val="single" w:color="C9D3EA" w:sz="6"/>
-              <w:bottom w:val="single" w:color="C9D3EA" w:sz="6"/>
-              <w:right w:val="single" w:color="C9D3EA" w:sz="6"/>
-            </w:tcBorders>
-            <w:shd w:fill="FBFCFF" w:color="auto" w:val="clear"/>
-            <w:tcMar>
-              <w:top w:type="dxa" w:w="15"/>
-              <w:left w:type="dxa" w:w="60"/>
-              <w:bottom w:type="dxa" w:w="15"/>
-              <w:right w:type="dxa" w:w="100"/>
-            </w:tcMar>
-            <w:vAlign w:val="center"/>
-          </w:tcPr>
-          <w:p>
-            <w:pPr>
-              <w:spacing w:after="0" w:before="0"/>
-            </w:pPr>
-            <w:r>
-              <w:rPr>
-                <w:rFonts w:ascii="Calibri" w:cs="Calibri" w:eastAsia="Calibri" w:hAnsi="Calibri"/>
-                <w:i w:val="false"/>
-                <w:iCs w:val="false"/>
-                <w:color w:val="333333"/>
-                <w:sz w:val="19"/>
-                <w:szCs w:val="19"/>
-              </w:rPr>
-              <w:t xml:space="preserve">rym krzyżowy</w:t>
-            </w:r>
-          </w:p>
-        </w:tc>
-      </w:tr>
-      <w:tr>
-        <w:trPr>
-          <w:cantSplit/>
-        </w:trPr>
-        <w:tc>
-          <w:tcPr>
-            <w:tcW w:type="dxa" w:w="2300"/>
-            <w:tcBorders>
-              <w:top w:val="single" w:color="C9D3EA" w:sz="6"/>
-              <w:left w:val="single" w:color="C9D3EA" w:sz="6"/>
-              <w:bottom w:val="single" w:color="C9D3EA" w:sz="6"/>
-              <w:right w:val="single" w:color="C9D3EA" w:sz="6"/>
-            </w:tcBorders>
-            <w:tcMar>
-              <w:top w:type="dxa" w:w="15"/>
-              <w:left w:type="dxa" w:w="60"/>
-              <w:bottom w:type="dxa" w:w="15"/>
-              <w:right w:type="dxa" w:w="100"/>
-            </w:tcMar>
-            <w:vAlign w:val="center"/>
-          </w:tcPr>
-          <w:p>
-            <w:pPr>
-              <w:spacing w:after="0" w:before="0"/>
-            </w:pPr>
-            <w:r>
-              <w:rPr>
-                <w:rFonts w:ascii="Calibri" w:cs="Calibri" w:eastAsia="Calibri" w:hAnsi="Calibri"/>
-                <w:b/>
-                <w:bCs/>
-                <w:color w:val="1E2761"/>
-                <w:sz w:val="19"/>
-                <w:szCs w:val="19"/>
-              </w:rPr>
-              <w:t xml:space="preserve">der umarmende Reim (abba)</w:t>
-            </w:r>
-          </w:p>
-        </w:tc>
-        <w:tc>
-          <w:tcPr>
-            <w:tcW w:type="dxa" w:w="3233"/>
-            <w:tcBorders>
-              <w:top w:val="single" w:color="C9D3EA" w:sz="6"/>
-              <w:left w:val="single" w:color="C9D3EA" w:sz="6"/>
-              <w:bottom w:val="single" w:color="C9D3EA" w:sz="6"/>
-              <w:right w:val="single" w:color="C9D3EA" w:sz="6"/>
-            </w:tcBorders>
-            <w:shd w:fill="FBFCFF" w:color="auto" w:val="clear"/>
-            <w:tcMar>
-              <w:top w:type="dxa" w:w="15"/>
-              <w:left w:type="dxa" w:w="60"/>
-              <w:bottom w:type="dxa" w:w="15"/>
-              <w:right w:type="dxa" w:w="100"/>
-            </w:tcMar>
-            <w:vAlign w:val="center"/>
-          </w:tcPr>
-          <w:p>
-            <w:pPr>
-              <w:spacing w:after="0" w:before="0"/>
-            </w:pPr>
-            <w:r>
-              <w:rPr>
-                <w:rFonts w:ascii="Calibri" w:cs="Calibri" w:eastAsia="Calibri" w:hAnsi="Calibri"/>
-                <w:i w:val="false"/>
-                <w:iCs w:val="false"/>
-                <w:color w:val="333333"/>
-                <w:sz w:val="19"/>
-                <w:szCs w:val="19"/>
-              </w:rPr>
-              <w:t xml:space="preserve">rym okalający</w:t>
-            </w:r>
-          </w:p>
-        </w:tc>
-        <w:tc>
-          <w:tcPr>
-            <w:tcW w:type="dxa" w:w="2300"/>
-            <w:tcBorders>
-              <w:top w:val="single" w:color="C9D3EA" w:sz="6"/>
-              <w:left w:val="single" w:color="C9D3EA" w:sz="6"/>
-              <w:bottom w:val="single" w:color="C9D3EA" w:sz="6"/>
-              <w:right w:val="single" w:color="C9D3EA" w:sz="6"/>
-            </w:tcBorders>
-            <w:tcMar>
-              <w:top w:type="dxa" w:w="15"/>
-              <w:left w:type="dxa" w:w="60"/>
-              <w:bottom w:type="dxa" w:w="15"/>
-              <w:right w:type="dxa" w:w="100"/>
-            </w:tcMar>
-            <w:vAlign w:val="center"/>
-          </w:tcPr>
-          <w:p>
-            <w:pPr>
-              <w:spacing w:after="0" w:before="0"/>
-            </w:pPr>
-            <w:r>
-              <w:rPr>
-                <w:rFonts w:ascii="Calibri" w:cs="Calibri" w:eastAsia="Calibri" w:hAnsi="Calibri"/>
-                <w:b/>
-                <w:bCs/>
-                <w:color w:val="1E2761"/>
-                <w:sz w:val="19"/>
-                <w:szCs w:val="19"/>
-              </w:rPr>
-              <w:t xml:space="preserve">der Kehrreim (x)</w:t>
-            </w:r>
-          </w:p>
-        </w:tc>
-        <w:tc>
-          <w:tcPr>
-            <w:tcW w:type="dxa" w:w="3233"/>
-            <w:tcBorders>
-              <w:top w:val="single" w:color="C9D3EA" w:sz="6"/>
-              <w:left w:val="single" w:color="C9D3EA" w:sz="6"/>
-              <w:bottom w:val="single" w:color="C9D3EA" w:sz="6"/>
-              <w:right w:val="single" w:color="C9D3EA" w:sz="6"/>
-            </w:tcBorders>
-            <w:shd w:fill="FBFCFF" w:color="auto" w:val="clear"/>
-            <w:tcMar>
-              <w:top w:type="dxa" w:w="15"/>
-              <w:left w:type="dxa" w:w="60"/>
-              <w:bottom w:type="dxa" w:w="15"/>
-              <w:right w:type="dxa" w:w="100"/>
-            </w:tcMar>
-            <w:vAlign w:val="center"/>
-          </w:tcPr>
-          <w:p>
-            <w:pPr>
-              <w:spacing w:after="0" w:before="0"/>
-            </w:pPr>
-            <w:r>
-              <w:rPr>
-                <w:rFonts w:ascii="Calibri" w:cs="Calibri" w:eastAsia="Calibri" w:hAnsi="Calibri"/>
-                <w:i w:val="false"/>
-                <w:iCs w:val="false"/>
-                <w:color w:val="333333"/>
-                <w:sz w:val="19"/>
-                <w:szCs w:val="19"/>
-              </w:rPr>
-              <w:t xml:space="preserve">refren – wers bez rymu, który się powtarza</w:t>
+              <w:t xml:space="preserve">kolejność rymów zapisana literami</w:t>
             </w:r>
           </w:p>
         </w:tc>
@@ -871,7 +585,7 @@
     </w:tbl>
     <w:p>
       <w:pPr>
-        <w:spacing w:after="40" w:before="40"/>
+        <w:spacing w:after="10" w:before="40"/>
       </w:pPr>
       <w:r>
         <w:rPr>
@@ -895,7 +609,115 @@
           <w:sz w:val="19"/>
           <w:szCs w:val="19"/>
         </w:rPr>
-        <w:t xml:space="preserve">Reguła: Słowa rymują się, gdy brzmią tak samo od ostatniej akcentowanej samogłoski (Schr-eck – Verst-eck). Końcówki wersów, które się rymują, dostają tę samą literę. Wers bez rymu = x. Przykład strofa 1: Riesenart – Bart (a a), groß – Wurfgeschoss (b b), „so ein Kerl war Paddy Fingal!“ (x) → Paarreim + Kehrreim.</w:t>
+        <w:t xml:space="preserve">Reguła: Słowa rymują się, gdy brzmią tak samo od ostatniej akcentowanej samogłoski (Schr-eck – Verst-eck). Końcówki wersów, które się rymują, dostają tę samą literę. Wers bez rymu = x. Używamy niemieckich nazw:</w:t>
+      </w:r>
+    </w:p>
+    <w:p>
+      <w:pPr>
+        <w:spacing w:after="0" w:before="0"/>
+      </w:pPr>
+      <w:r>
+        <w:rPr>
+          <w:rFonts w:ascii="Calibri" w:cs="Calibri" w:eastAsia="Calibri" w:hAnsi="Calibri"/>
+          <w:b/>
+          <w:bCs/>
+          <w:color w:val="000000"/>
+          <w:sz w:val="20"/>
+          <w:szCs w:val="20"/>
+        </w:rPr>
+        <w:t xml:space="preserve">Paarreim (aabb)</w:t>
+      </w:r>
+      <w:r>
+        <w:rPr>
+          <w:rFonts w:ascii="Calibri" w:cs="Calibri" w:eastAsia="Calibri" w:hAnsi="Calibri"/>
+          <w:i w:val="false"/>
+          <w:iCs w:val="false"/>
+          <w:color w:val="5B4A8A"/>
+          <w:sz w:val="19"/>
+          <w:szCs w:val="19"/>
+        </w:rPr>
+        <w:t xml:space="preserve">  – rymują się wersy 1 i 2 oraz 3 i 4</w:t>
+      </w:r>
+    </w:p>
+    <w:p>
+      <w:pPr>
+        <w:spacing w:after="0" w:before="0"/>
+      </w:pPr>
+      <w:r>
+        <w:rPr>
+          <w:rFonts w:ascii="Calibri" w:cs="Calibri" w:eastAsia="Calibri" w:hAnsi="Calibri"/>
+          <w:b/>
+          <w:bCs/>
+          <w:color w:val="000000"/>
+          <w:sz w:val="20"/>
+          <w:szCs w:val="20"/>
+        </w:rPr>
+        <w:t xml:space="preserve">Kreuzreim (abab)</w:t>
+      </w:r>
+      <w:r>
+        <w:rPr>
+          <w:rFonts w:ascii="Calibri" w:cs="Calibri" w:eastAsia="Calibri" w:hAnsi="Calibri"/>
+          <w:i w:val="false"/>
+          <w:iCs w:val="false"/>
+          <w:color w:val="5B4A8A"/>
+          <w:sz w:val="19"/>
+          <w:szCs w:val="19"/>
+        </w:rPr>
+        <w:t xml:space="preserve">  – rymują się wersy 1 i 3 oraz 2 i 4</w:t>
+      </w:r>
+    </w:p>
+    <w:p>
+      <w:pPr>
+        <w:spacing w:after="0" w:before="0"/>
+      </w:pPr>
+      <w:r>
+        <w:rPr>
+          <w:rFonts w:ascii="Calibri" w:cs="Calibri" w:eastAsia="Calibri" w:hAnsi="Calibri"/>
+          <w:b/>
+          <w:bCs/>
+          <w:color w:val="000000"/>
+          <w:sz w:val="20"/>
+          <w:szCs w:val="20"/>
+        </w:rPr>
+        <w:t xml:space="preserve">umarmender Reim (abba)</w:t>
+      </w:r>
+      <w:r>
+        <w:rPr>
+          <w:rFonts w:ascii="Calibri" w:cs="Calibri" w:eastAsia="Calibri" w:hAnsi="Calibri"/>
+          <w:i w:val="false"/>
+          <w:iCs w:val="false"/>
+          <w:color w:val="5B4A8A"/>
+          <w:sz w:val="19"/>
+          <w:szCs w:val="19"/>
+        </w:rPr>
+        <w:t xml:space="preserve">  – rymują się wersy 1 i 4 oraz 2 i 3</w:t>
+      </w:r>
+    </w:p>
+    <w:p>
+      <w:pPr>
+        <w:spacing w:after="40" w:before="0"/>
+      </w:pPr>
+      <w:r>
+        <w:rPr>
+          <w:rFonts w:ascii="Calibri" w:cs="Calibri" w:eastAsia="Calibri" w:hAnsi="Calibri"/>
+          <w:b/>
+          <w:bCs/>
+          <w:color w:val="000000"/>
+          <w:sz w:val="20"/>
+          <w:szCs w:val="20"/>
+        </w:rPr>
+        <w:t xml:space="preserve">Kehrreim (x)</w:t>
+      </w:r>
+      <w:r>
+        <w:rPr>
+          <w:rFonts w:ascii="Calibri" w:cs="Calibri" w:eastAsia="Calibri" w:hAnsi="Calibri"/>
+          <w:i w:val="false"/>
+          <w:iCs w:val="false"/>
+          <w:color w:val="5B4A8A"/>
+          <w:sz w:val="19"/>
+          <w:szCs w:val="19"/>
+        </w:rPr>
+        <w:t xml:space="preserve">  – wers bez rymu, który powtarza się w każdej strofie</w:t>
       </w:r>
     </w:p>
     <w:p>
@@ -949,36 +771,7 @@
           <w:sz w:val="19"/>
           <w:szCs w:val="19"/>
         </w:rPr>
-        <w:t xml:space="preserve">Przeczytaj półgłosem końcówki wersów. Za każdym wersem wpisz literę (a, b … albo x) i nazwij rodzaj rymu (Paarreim, Kreuzreim, umarmender Reim).</w:t>
-      </w:r>
-    </w:p>
-    <w:p>
-      <w:pPr>
-        <w:spacing w:after="40" w:before="0"/>
-      </w:pPr>
-      <w:r>
-        <w:rPr>
-          <w:rFonts w:ascii="Calibri" w:cs="Calibri" w:eastAsia="Calibri" w:hAnsi="Calibri"/>
-          <w:b/>
-          <w:bCs/>
-          <w:i w:val="false"/>
-          <w:iCs w:val="false"/>
-          <w:color w:val="5B4A8A"/>
-          <w:sz w:val="19"/>
-          <w:szCs w:val="19"/>
-        </w:rPr>
-        <w:t xml:space="preserve">PL: </w:t>
-      </w:r>
-      <w:r>
-        <w:rPr>
-          <w:rFonts w:ascii="Calibri" w:cs="Calibri" w:eastAsia="Calibri" w:hAnsi="Calibri"/>
-          <w:i/>
-          <w:iCs/>
-          <w:color w:val="5B4A8A"/>
-          <w:sz w:val="19"/>
-          <w:szCs w:val="19"/>
-        </w:rPr>
-        <w:t xml:space="preserve">O czym są teksty: 2 „Beim Heben“ – hala jest jeszcze zimna, sztanga już leży, pierwsza próba jest trudna, ale ktoś woła „Tak!“. 3 „Auf der Matte“ – walka judo: przeciwnik trzyma mnie za kołnierz, rzut i spokój. 4 „Im Siebenmeterkreis“ – piłka ręczna: 10 sekund do końca, wbiegam, rzucam, gol – cała hala krzyczy.</w:t>
+        <w:t xml:space="preserve">Przeczytaj półgłosem końcówki wersów. Za każdym wersem wpisz literę (a, b … albo x) i podaj niemiecką nazwę rymu. Nr 1 to strofa 4 z ballady, nr 2–4 to teksty o piłce ręcznej.</w:t>
       </w:r>
     </w:p>
     <w:tbl>
@@ -1033,7 +826,7 @@
                 <w:sz w:val="19"/>
                 <w:szCs w:val="19"/>
               </w:rPr>
-              <w:t xml:space="preserve">die Hantel</w:t>
+              <w:t xml:space="preserve">der Pass · die Abwehr</w:t>
             </w:r>
           </w:p>
         </w:tc>
@@ -1068,7 +861,7 @@
                 <w:sz w:val="19"/>
                 <w:szCs w:val="19"/>
               </w:rPr>
-              <w:t xml:space="preserve">sztanga</w:t>
+              <w:t xml:space="preserve">podanie · obrona</w:t>
             </w:r>
           </w:p>
         </w:tc>
@@ -1102,7 +895,7 @@
                 <w:sz w:val="19"/>
                 <w:szCs w:val="19"/>
               </w:rPr>
-              <w:t xml:space="preserve">der Versuch</w:t>
+              <w:t xml:space="preserve">täuschen · der Gegner</w:t>
             </w:r>
           </w:p>
         </w:tc>
@@ -1137,7 +930,7 @@
                 <w:sz w:val="19"/>
                 <w:szCs w:val="19"/>
               </w:rPr>
-              <w:t xml:space="preserve">próba</w:t>
+              <w:t xml:space="preserve">zrobić zwód · przeciwnik</w:t>
             </w:r>
           </w:p>
         </w:tc>
@@ -1176,7 +969,7 @@
                 <w:sz w:val="19"/>
                 <w:szCs w:val="19"/>
               </w:rPr>
-              <w:t xml:space="preserve">der Kragen · wagen</w:t>
+              <w:t xml:space="preserve">die Halle bebt</w:t>
             </w:r>
           </w:p>
         </w:tc>
@@ -1211,7 +1004,7 @@
                 <w:sz w:val="19"/>
                 <w:szCs w:val="19"/>
               </w:rPr>
-              <w:t xml:space="preserve">kołnierz · zaryzykować</w:t>
+              <w:t xml:space="preserve">hala drży (z emocji)</w:t>
             </w:r>
           </w:p>
         </w:tc>
@@ -1245,7 +1038,7 @@
                 <w:sz w:val="19"/>
                 <w:szCs w:val="19"/>
               </w:rPr>
-              <w:t xml:space="preserve">der Wurf · die Ruh(e)</w:t>
+              <w:t xml:space="preserve">wir liegen hinten</w:t>
             </w:r>
           </w:p>
         </w:tc>
@@ -1280,7 +1073,150 @@
                 <w:sz w:val="19"/>
                 <w:szCs w:val="19"/>
               </w:rPr>
-              <w:t xml:space="preserve">rzut · spokój</w:t>
+              <w:t xml:space="preserve">przegrywamy</w:t>
+            </w:r>
+          </w:p>
+        </w:tc>
+      </w:tr>
+      <w:tr>
+        <w:trPr>
+          <w:cantSplit/>
+        </w:trPr>
+        <w:tc>
+          <w:tcPr>
+            <w:tcW w:type="dxa" w:w="2300"/>
+            <w:tcBorders>
+              <w:top w:val="single" w:color="C9D3EA" w:sz="6"/>
+              <w:left w:val="single" w:color="C9D3EA" w:sz="6"/>
+              <w:bottom w:val="single" w:color="C9D3EA" w:sz="6"/>
+              <w:right w:val="single" w:color="C9D3EA" w:sz="6"/>
+            </w:tcBorders>
+            <w:tcMar>
+              <w:top w:type="dxa" w:w="15"/>
+              <w:left w:type="dxa" w:w="60"/>
+              <w:bottom w:type="dxa" w:w="15"/>
+              <w:right w:type="dxa" w:w="100"/>
+            </w:tcMar>
+            <w:vAlign w:val="center"/>
+          </w:tcPr>
+          <w:p>
+            <w:pPr>
+              <w:spacing w:after="0" w:before="0"/>
+            </w:pPr>
+            <w:r>
+              <w:rPr>
+                <w:rFonts w:ascii="Calibri" w:cs="Calibri" w:eastAsia="Calibri" w:hAnsi="Calibri"/>
+                <w:b/>
+                <w:bCs/>
+                <w:color w:val="1E2761"/>
+                <w:sz w:val="19"/>
+                <w:szCs w:val="19"/>
+              </w:rPr>
+              <w:t xml:space="preserve">das Tor · ums Ziel kämpfen</w:t>
+            </w:r>
+          </w:p>
+        </w:tc>
+        <w:tc>
+          <w:tcPr>
+            <w:tcW w:type="dxa" w:w="3233"/>
+            <w:tcBorders>
+              <w:top w:val="single" w:color="C9D3EA" w:sz="6"/>
+              <w:left w:val="single" w:color="C9D3EA" w:sz="6"/>
+              <w:bottom w:val="single" w:color="C9D3EA" w:sz="6"/>
+              <w:right w:val="single" w:color="C9D3EA" w:sz="6"/>
+            </w:tcBorders>
+            <w:shd w:fill="FBFCFF" w:color="auto" w:val="clear"/>
+            <w:tcMar>
+              <w:top w:type="dxa" w:w="15"/>
+              <w:left w:type="dxa" w:w="60"/>
+              <w:bottom w:type="dxa" w:w="15"/>
+              <w:right w:type="dxa" w:w="100"/>
+            </w:tcMar>
+            <w:vAlign w:val="center"/>
+          </w:tcPr>
+          <w:p>
+            <w:pPr>
+              <w:spacing w:after="0" w:before="0"/>
+            </w:pPr>
+            <w:r>
+              <w:rPr>
+                <w:rFonts w:ascii="Calibri" w:cs="Calibri" w:eastAsia="Calibri" w:hAnsi="Calibri"/>
+                <w:i w:val="false"/>
+                <w:iCs w:val="false"/>
+                <w:color w:val="333333"/>
+                <w:sz w:val="19"/>
+                <w:szCs w:val="19"/>
+              </w:rPr>
+              <w:t xml:space="preserve">bramka (gol) · walczyć o cel</w:t>
+            </w:r>
+          </w:p>
+        </w:tc>
+        <w:tc>
+          <w:tcPr>
+            <w:tcW w:type="dxa" w:w="2300"/>
+            <w:tcBorders>
+              <w:top w:val="single" w:color="C9D3EA" w:sz="6"/>
+              <w:left w:val="single" w:color="C9D3EA" w:sz="6"/>
+              <w:bottom w:val="single" w:color="C9D3EA" w:sz="6"/>
+              <w:right w:val="single" w:color="C9D3EA" w:sz="6"/>
+            </w:tcBorders>
+            <w:tcMar>
+              <w:top w:type="dxa" w:w="15"/>
+              <w:left w:type="dxa" w:w="60"/>
+              <w:bottom w:type="dxa" w:w="15"/>
+              <w:right w:type="dxa" w:w="100"/>
+            </w:tcMar>
+            <w:vAlign w:val="center"/>
+          </w:tcPr>
+          <w:p>
+            <w:pPr>
+              <w:spacing w:after="0" w:before="0"/>
+            </w:pPr>
+            <w:r>
+              <w:rPr>
+                <w:rFonts w:ascii="Calibri" w:cs="Calibri" w:eastAsia="Calibri" w:hAnsi="Calibri"/>
+                <w:b/>
+                <w:bCs/>
+                <w:color w:val="1E2761"/>
+                <w:sz w:val="19"/>
+                <w:szCs w:val="19"/>
+              </w:rPr>
+              <w:t xml:space="preserve">der Wurf · schrein (schreien)</w:t>
+            </w:r>
+          </w:p>
+        </w:tc>
+        <w:tc>
+          <w:tcPr>
+            <w:tcW w:type="dxa" w:w="3233"/>
+            <w:tcBorders>
+              <w:top w:val="single" w:color="C9D3EA" w:sz="6"/>
+              <w:left w:val="single" w:color="C9D3EA" w:sz="6"/>
+              <w:bottom w:val="single" w:color="C9D3EA" w:sz="6"/>
+              <w:right w:val="single" w:color="C9D3EA" w:sz="6"/>
+            </w:tcBorders>
+            <w:shd w:fill="FBFCFF" w:color="auto" w:val="clear"/>
+            <w:tcMar>
+              <w:top w:type="dxa" w:w="15"/>
+              <w:left w:type="dxa" w:w="60"/>
+              <w:bottom w:type="dxa" w:w="15"/>
+              <w:right w:type="dxa" w:w="100"/>
+            </w:tcMar>
+            <w:vAlign w:val="center"/>
+          </w:tcPr>
+          <w:p>
+            <w:pPr>
+              <w:spacing w:after="0" w:before="0"/>
+            </w:pPr>
+            <w:r>
+              <w:rPr>
+                <w:rFonts w:ascii="Calibri" w:cs="Calibri" w:eastAsia="Calibri" w:hAnsi="Calibri"/>
+                <w:i w:val="false"/>
+                <w:iCs w:val="false"/>
+                <w:color w:val="333333"/>
+                <w:sz w:val="19"/>
+                <w:szCs w:val="19"/>
+              </w:rPr>
+              <w:t xml:space="preserve">rzut · krzyczeć</w:t>
             </w:r>
           </w:p>
         </w:tc>
@@ -1337,7 +1273,7 @@
           <w:sz w:val="19"/>
           <w:szCs w:val="19"/>
         </w:rPr>
-        <w:t xml:space="preserve">Sprawdzenie celu: określ układ rymów w strofie 6 (wersy 26–30), nazwij rodzaj rymu i wskaż refren. Potem: jaki to rym – „Ball – Tor – Fall – vor“? Porównaj z rozwiązaniem i popraw na zielono.</w:t>
+        <w:t xml:space="preserve">Sprawdzenie celu: zapisz literami rymy w strofie 6 (wersy 26–30), podaj niemiecką nazwę rymu i wskaż Kehrreim. Potem: jaki to rym – „Ball – Tor – Fall – vor“? Porównaj z rozwiązaniem i popraw na zielono.</w:t>
       </w:r>
     </w:p>
     <w:sectPr>

</xml_diff>